<commit_message>
Add CLAUDE.md and update project documentation
Co-Authored-By: Claude Opus 4.6 <noreply@anthropic.com>
</commit_message>
<xml_diff>
--- a/HoldPoint-Project-Documentation.docx
+++ b/HoldPoint-Project-Documentation.docx
@@ -4151,6 +4151,237 @@
           <w:szCs w:val="22"/>
         </w:rPr>
         <w:t xml:space="preserve">Assume everything will be interrupted. Design every resource (audio, timers, wake lock, network) to recover automatically. Consolidate recovery into one function. Layer multiple detection mechanisms. Use wall-clock time, not intervals. Test by setting your phone’s screen lock to 30 seconds and using the app normally — every interruption you encounter in testing will happen to your users in real life.</w:t>
+      </w:r>
+    </w:p>
+    <w:p>
+      <w:pPr>
+        <w:pStyle w:val="Heading2"/>
+      </w:pPr>
+      <w:r>
+        <w:rPr>
+          <w:rFonts w:ascii="Arial" w:cs="Arial" w:eastAsia="Arial" w:hAnsi="Arial"/>
+        </w:rPr>
+        <w:t xml:space="preserve">4.21 iOS PWA localStorage Persistence (v0.3.4)</w:t>
+      </w:r>
+    </w:p>
+    <w:p>
+      <w:pPr>
+        <w:spacing w:after="100"/>
+      </w:pPr>
+      <w:r>
+        <w:rPr>
+          <w:rFonts w:ascii="Arial" w:cs="Arial" w:eastAsia="Arial" w:hAnsi="Arial"/>
+          <w:b/>
+          <w:bCs/>
+          <w:sz w:val="22"/>
+          <w:szCs w:val="22"/>
+        </w:rPr>
+        <w:t xml:space="preserve">Problem</w:t>
+      </w:r>
+    </w:p>
+    <w:p>
+      <w:pPr>
+        <w:spacing w:after="160"/>
+      </w:pPr>
+      <w:r>
+        <w:rPr>
+          <w:rFonts w:ascii="Arial" w:cs="Arial" w:eastAsia="Arial" w:hAnsi="Arial"/>
+          <w:sz w:val="22"/>
+          <w:szCs w:val="22"/>
+        </w:rPr>
+        <w:t xml:space="preserve">When a user completed two yoga routines back-to-back on iOS, only the second session was saved. The first session’s localStorage write was lost because iOS kills PWA processes when the app is backgrounded (e.g., switching to another app between routines). The write from completeSession() never flushed to disk before the OS reclaimed the process.</w:t>
+      </w:r>
+    </w:p>
+    <w:p>
+      <w:pPr>
+        <w:spacing w:after="100"/>
+      </w:pPr>
+      <w:r>
+        <w:rPr>
+          <w:rFonts w:ascii="Arial" w:cs="Arial" w:eastAsia="Arial" w:hAnsi="Arial"/>
+          <w:b/>
+          <w:bCs/>
+          <w:sz w:val="22"/>
+          <w:szCs w:val="22"/>
+        </w:rPr>
+        <w:t xml:space="preserve">Root Cause</w:t>
+      </w:r>
+    </w:p>
+    <w:p>
+      <w:pPr>
+        <w:spacing w:after="160"/>
+      </w:pPr>
+      <w:r>
+        <w:rPr>
+          <w:rFonts w:ascii="Arial" w:cs="Arial" w:eastAsia="Arial" w:hAnsi="Arial"/>
+          <w:sz w:val="22"/>
+          <w:szCs w:val="22"/>
+        </w:rPr>
+        <w:t xml:space="preserve">iOS Safari’s PWA runtime doesn’t guarantee localStorage writes persist if the process is terminated shortly after the write. Unlike desktop browsers, there’s no graceful shutdown window. The OS simply kills the WebKit process, and any pending I/O (including localStorage flushes) may be discarded.</w:t>
+      </w:r>
+    </w:p>
+    <w:p>
+      <w:pPr>
+        <w:spacing w:after="100"/>
+      </w:pPr>
+      <w:r>
+        <w:rPr>
+          <w:rFonts w:ascii="Arial" w:cs="Arial" w:eastAsia="Arial" w:hAnsi="Arial"/>
+          <w:b/>
+          <w:bCs/>
+          <w:sz w:val="22"/>
+          <w:szCs w:val="22"/>
+        </w:rPr>
+        <w:t xml:space="preserve">Fix (v0.3.4)</w:t>
+      </w:r>
+    </w:p>
+    <w:p>
+      <w:pPr>
+        <w:spacing w:after="160"/>
+      </w:pPr>
+      <w:r>
+        <w:rPr>
+          <w:rFonts w:ascii="Arial" w:cs="Arial" w:eastAsia="Arial" w:hAnsi="Arial"/>
+          <w:sz w:val="22"/>
+          <w:szCs w:val="22"/>
+        </w:rPr>
+        <w:t xml:space="preserve">A multi-layered persistence strategy was implemented: (1) A forceSaveAllState() function that writes session history, settings, and hangboard settings to localStorage with immediate read-back verification. (2) Three lifecycle event listeners — visibilitychange (fires when the tab goes hidden), pagehide (fires when the page is being unloaded), and beforeunload (fires on navigation away) — each calling forceSaveAllState(). (3) navigator.storage.persist() is requested on load to hint to iOS that this storage should not be evicted. (4) completeSession() now verifies its localStorage write by reading back the value and comparing it to the payload that was written, logging a warning if the read-back doesn’t match.</w:t>
+      </w:r>
+    </w:p>
+    <w:p>
+      <w:pPr>
+        <w:spacing w:after="100"/>
+      </w:pPr>
+      <w:r>
+        <w:rPr>
+          <w:rFonts w:ascii="Arial" w:cs="Arial" w:eastAsia="Arial" w:hAnsi="Arial"/>
+          <w:b/>
+          <w:bCs/>
+          <w:sz w:val="22"/>
+          <w:szCs w:val="22"/>
+        </w:rPr>
+        <w:t xml:space="preserve">Lesson</w:t>
+      </w:r>
+    </w:p>
+    <w:p>
+      <w:pPr>
+        <w:spacing w:after="160"/>
+      </w:pPr>
+      <w:r>
+        <w:rPr>
+          <w:rFonts w:ascii="Arial" w:cs="Arial" w:eastAsia="Arial" w:hAnsi="Arial"/>
+          <w:sz w:val="22"/>
+          <w:szCs w:val="22"/>
+        </w:rPr>
+        <w:t xml:space="preserve">On iOS PWAs, never assume a single localStorage.setItem() call will survive. Treat every write as potentially the last thing your app does before being killed. Save aggressively on every lifecycle transition, verify writes immediately, and request persistent storage. This is the PWA equivalent of auto-saving a document after every keystroke.</w:t>
+      </w:r>
+    </w:p>
+    <w:p>
+      <w:pPr>
+        <w:pStyle w:val="Heading2"/>
+      </w:pPr>
+      <w:r>
+        <w:rPr>
+          <w:rFonts w:ascii="Arial" w:cs="Arial" w:eastAsia="Arial" w:hAnsi="Arial"/>
+        </w:rPr>
+        <w:t xml:space="preserve">4.22 Customizable Hangboard Settings (v0.3.5)</w:t>
+      </w:r>
+    </w:p>
+    <w:p>
+      <w:pPr>
+        <w:spacing w:after="100"/>
+      </w:pPr>
+      <w:r>
+        <w:rPr>
+          <w:rFonts w:ascii="Arial" w:cs="Arial" w:eastAsia="Arial" w:hAnsi="Arial"/>
+          <w:b/>
+          <w:bCs/>
+          <w:sz w:val="22"/>
+          <w:szCs w:val="22"/>
+        </w:rPr>
+        <w:t xml:space="preserve">Feature</w:t>
+      </w:r>
+    </w:p>
+    <w:p>
+      <w:pPr>
+        <w:spacing w:after="160"/>
+      </w:pPr>
+      <w:r>
+        <w:rPr>
+          <w:rFonts w:ascii="Arial" w:cs="Arial" w:eastAsia="Arial" w:hAnsi="Arial"/>
+          <w:sz w:val="22"/>
+          <w:szCs w:val="22"/>
+        </w:rPr>
+        <w:t xml:space="preserve">Hangboard routines previously used fixed parameters: 3 sets per grip, 7-second hangs, 3-second rest between reps, and 3 minutes between sets. Users can now customize all four values via a stepper control panel that appears on the routine detail screen for hangboard workouts.</w:t>
+      </w:r>
+    </w:p>
+    <w:p>
+      <w:pPr>
+        <w:spacing w:after="100"/>
+      </w:pPr>
+      <w:r>
+        <w:rPr>
+          <w:rFonts w:ascii="Arial" w:cs="Arial" w:eastAsia="Arial" w:hAnsi="Arial"/>
+          <w:b/>
+          <w:bCs/>
+          <w:sz w:val="22"/>
+          <w:szCs w:val="22"/>
+        </w:rPr>
+        <w:t xml:space="preserve">Implementation</w:t>
+      </w:r>
+    </w:p>
+    <w:p>
+      <w:pPr>
+        <w:spacing w:after="160"/>
+      </w:pPr>
+      <w:r>
+        <w:rPr>
+          <w:rFonts w:ascii="Arial" w:cs="Arial" w:eastAsia="Arial" w:hAnsi="Arial"/>
+          <w:sz w:val="22"/>
+          <w:szCs w:val="22"/>
+        </w:rPr>
+        <w:t xml:space="preserve">Four settings are adjustable: sets per grip (1–10, default 3), hang time (3–30s, default 7s), rest between reps (1–30s, default 3s), and rest between sets (30–600s in 30s increments, default 180s). Each has a stepper UI with minus/plus buttons. Settings are stored in localStorage per user (hp_hb_settings_{email}) and loaded whenever the routine detail screen opens.</w:t>
+      </w:r>
+    </w:p>
+    <w:p>
+      <w:pPr>
+        <w:spacing w:after="160"/>
+      </w:pPr>
+      <w:r>
+        <w:rPr>
+          <w:rFonts w:ascii="Arial" w:cs="Arial" w:eastAsia="Arial" w:hAnsi="Arial"/>
+          <w:sz w:val="22"/>
+          <w:szCs w:val="22"/>
+        </w:rPr>
+        <w:t xml:space="preserve">The design deliberately separates base routine data from user overrides. The data.js routine definitions remain unchanged. At runtime, applyHbOverrides() creates a shallow copy of the routine with user settings applied. This means the routine detail screen (grip count, rest rows, total duration) dynamically updates as settings change, and the timer uses the overridden values. The settings panel is hidden for yoga routines and only shown for hangboard workouts.</w:t>
+      </w:r>
+    </w:p>
+    <w:p>
+      <w:pPr>
+        <w:spacing w:after="100"/>
+      </w:pPr>
+      <w:r>
+        <w:rPr>
+          <w:rFonts w:ascii="Arial" w:cs="Arial" w:eastAsia="Arial" w:hAnsi="Arial"/>
+          <w:b/>
+          <w:bCs/>
+          <w:sz w:val="22"/>
+          <w:szCs w:val="22"/>
+        </w:rPr>
+        <w:t xml:space="preserve">Architecture Pattern</w:t>
+      </w:r>
+    </w:p>
+    <w:p>
+      <w:pPr>
+        <w:spacing w:after="160"/>
+      </w:pPr>
+      <w:r>
+        <w:rPr>
+          <w:rFonts w:ascii="Arial" w:cs="Arial" w:eastAsia="Arial" w:hAnsi="Arial"/>
+          <w:sz w:val="22"/>
+          <w:szCs w:val="22"/>
+        </w:rPr>
+        <w:t xml:space="preserve">This follows a “defaults + overrides” pattern: define sensible defaults in the data layer, let users customize at runtime, persist their preferences, and apply overrides as a non-destructive copy. The base data never mutates, so resetting to defaults is trivial and multiple users on the same device get independent settings. The hangboard settings are also included in forceSaveAllState() for iOS persistence resilience.</w:t>
       </w:r>
     </w:p>
     <w:p>

</xml_diff>